<commit_message>
Deploy preview for PR 69 🛫
</commit_message>
<xml_diff>
--- a/pr-preview/pr-69/chapters/01-introduction-tracked-changes.docx
+++ b/pr-preview/pr-69/chapters/01-introduction-tracked-changes.docx
@@ -918,10 +918,10 @@
       </w:r>
       <m:oMath>
         <m:r>
-          <m:t>P</m:t>
-        </m:r>
-        <m:r>
-          <m:t>r</m:t>
+          <m:rPr>
+            <m:sty m:val="p"/>
+          </m:rPr>
+          <m:t>Pr</m:t>
         </m:r>
         <m:r>
           <m:rPr>
@@ -1010,10 +1010,10 @@
       </w:r>
       <m:oMath>
         <m:r>
-          <m:t>P</m:t>
-        </m:r>
-        <m:r>
-          <m:t>r</m:t>
+          <m:rPr>
+            <m:sty m:val="p"/>
+          </m:rPr>
+          <m:t>Pr</m:t>
         </m:r>
         <m:r>
           <m:rPr>
@@ -1157,10 +1157,10 @@
         </m:oMathParaPr>
         <m:oMath>
           <m:r>
-            <m:t>P</m:t>
-          </m:r>
-          <m:r>
-            <m:t>r</m:t>
+            <m:rPr>
+              <m:sty m:val="p"/>
+            </m:rPr>
+            <m:t>Pr</m:t>
           </m:r>
           <m:r>
             <m:rPr>
@@ -1211,10 +1211,10 @@
             <m:t>≠</m:t>
           </m:r>
           <m:r>
-            <m:t>P</m:t>
-          </m:r>
-          <m:r>
-            <m:t>r</m:t>
+            <m:rPr>
+              <m:sty m:val="p"/>
+            </m:rPr>
+            <m:t>Pr</m:t>
           </m:r>
           <m:r>
             <m:rPr>
@@ -1872,10 +1872,10 @@
         </m:oMathParaPr>
         <m:oMath>
           <m:r>
-            <m:t>P</m:t>
-          </m:r>
-          <m:r>
-            <m:t>r</m:t>
+            <m:rPr>
+              <m:sty m:val="p"/>
+            </m:rPr>
+            <m:t>Pr</m:t>
           </m:r>
           <m:r>
             <m:rPr>
@@ -1926,10 +1926,10 @@
             <m:t>−</m:t>
           </m:r>
           <m:r>
-            <m:t>P</m:t>
-          </m:r>
-          <m:r>
-            <m:t>r</m:t>
+            <m:rPr>
+              <m:sty m:val="p"/>
+            </m:rPr>
+            <m:t>Pr</m:t>
           </m:r>
           <m:r>
             <m:rPr>
@@ -2009,10 +2009,10 @@
             </m:fPr>
             <m:num>
               <m:r>
-                <m:t>P</m:t>
-              </m:r>
-              <m:r>
-                <m:t>r</m:t>
+                <m:rPr>
+                  <m:sty m:val="p"/>
+                </m:rPr>
+                <m:t>Pr</m:t>
               </m:r>
               <m:r>
                 <m:rPr>
@@ -2059,10 +2059,10 @@
             </m:num>
             <m:den>
               <m:r>
-                <m:t>P</m:t>
-              </m:r>
-              <m:r>
-                <m:t>r</m:t>
+                <m:rPr>
+                  <m:sty m:val="p"/>
+                </m:rPr>
+                <m:t>Pr</m:t>
               </m:r>
               <m:r>
                 <m:rPr>
@@ -2144,10 +2144,10 @@
             </m:fPr>
             <m:num>
               <m:r>
-                <m:t>P</m:t>
-              </m:r>
-              <m:r>
-                <m:t>r</m:t>
+                <m:rPr>
+                  <m:sty m:val="p"/>
+                </m:rPr>
+                <m:t>Pr</m:t>
               </m:r>
               <m:r>
                 <m:rPr>
@@ -2198,10 +2198,10 @@
                 <m:t>/</m:t>
               </m:r>
               <m:r>
-                <m:t>P</m:t>
-              </m:r>
-              <m:r>
-                <m:t>r</m:t>
+                <m:rPr>
+                  <m:sty m:val="p"/>
+                </m:rPr>
+                <m:t>Pr</m:t>
               </m:r>
               <m:r>
                 <m:rPr>
@@ -2248,10 +2248,10 @@
             </m:num>
             <m:den>
               <m:r>
-                <m:t>P</m:t>
-              </m:r>
-              <m:r>
-                <m:t>r</m:t>
+                <m:rPr>
+                  <m:sty m:val="p"/>
+                </m:rPr>
+                <m:t>Pr</m:t>
               </m:r>
               <m:r>
                 <m:rPr>
@@ -2302,10 +2302,10 @@
                 <m:t>/</m:t>
               </m:r>
               <m:r>
-                <m:t>P</m:t>
-              </m:r>
-              <m:r>
-                <m:t>r</m:t>
+                <m:rPr>
+                  <m:sty m:val="p"/>
+                </m:rPr>
+                <m:t>Pr</m:t>
               </m:r>
               <m:r>
                 <m:rPr>
@@ -2784,43 +2784,45 @@
           </m:accPr>
           <m:e>
             <m:r>
+              <m:rPr>
+                <m:nor/>
+                <m:sty m:val="p"/>
+              </m:rPr>
               <m:t>E</m:t>
             </m:r>
           </m:e>
         </m:acc>
-        <m:r>
-          <m:rPr>
-            <m:sty m:val="p"/>
-          </m:rPr>
-          <m:t>[</m:t>
-        </m:r>
-        <m:sSup>
+        <m:d>
+          <m:dPr>
+            <m:begChr m:val="["/>
+            <m:sepChr m:val=""/>
+            <m:endChr m:val="]"/>
+            <m:grow/>
+          </m:dPr>
           <m:e>
-            <m:r>
-              <m:t>Y</m:t>
-            </m:r>
+            <m:sSup>
+              <m:e>
+                <m:r>
+                  <m:t>Y</m:t>
+                </m:r>
+              </m:e>
+              <m:sup>
+                <m:r>
+                  <m:t>a</m:t>
+                </m:r>
+                <m:r>
+                  <m:rPr>
+                    <m:sty m:val="p"/>
+                  </m:rPr>
+                  <m:t>=</m:t>
+                </m:r>
+                <m:r>
+                  <m:t>1</m:t>
+                </m:r>
+              </m:sup>
+            </m:sSup>
           </m:e>
-          <m:sup>
-            <m:r>
-              <m:t>a</m:t>
-            </m:r>
-            <m:r>
-              <m:rPr>
-                <m:sty m:val="p"/>
-              </m:rPr>
-              <m:t>=</m:t>
-            </m:r>
-            <m:r>
-              <m:t>1</m:t>
-            </m:r>
-          </m:sup>
-        </m:sSup>
-        <m:r>
-          <m:rPr>
-            <m:sty m:val="p"/>
-          </m:rPr>
-          <m:t>]</m:t>
-        </m:r>
+        </m:d>
         <m:r>
           <m:rPr>
             <m:sty m:val="p"/>
@@ -2847,43 +2849,45 @@
           </m:accPr>
           <m:e>
             <m:r>
+              <m:rPr>
+                <m:nor/>
+                <m:sty m:val="p"/>
+              </m:rPr>
               <m:t>E</m:t>
             </m:r>
           </m:e>
         </m:acc>
-        <m:r>
-          <m:rPr>
-            <m:sty m:val="p"/>
-          </m:rPr>
-          <m:t>[</m:t>
-        </m:r>
-        <m:sSup>
+        <m:d>
+          <m:dPr>
+            <m:begChr m:val="["/>
+            <m:sepChr m:val=""/>
+            <m:endChr m:val="]"/>
+            <m:grow/>
+          </m:dPr>
           <m:e>
-            <m:r>
-              <m:t>Y</m:t>
-            </m:r>
+            <m:sSup>
+              <m:e>
+                <m:r>
+                  <m:t>Y</m:t>
+                </m:r>
+              </m:e>
+              <m:sup>
+                <m:r>
+                  <m:t>a</m:t>
+                </m:r>
+                <m:r>
+                  <m:rPr>
+                    <m:sty m:val="p"/>
+                  </m:rPr>
+                  <m:t>=</m:t>
+                </m:r>
+                <m:r>
+                  <m:t>0</m:t>
+                </m:r>
+              </m:sup>
+            </m:sSup>
           </m:e>
-          <m:sup>
-            <m:r>
-              <m:t>a</m:t>
-            </m:r>
-            <m:r>
-              <m:rPr>
-                <m:sty m:val="p"/>
-              </m:rPr>
-              <m:t>=</m:t>
-            </m:r>
-            <m:r>
-              <m:t>0</m:t>
-            </m:r>
-          </m:sup>
-        </m:sSup>
-        <m:r>
-          <m:rPr>
-            <m:sty m:val="p"/>
-          </m:rPr>
-          <m:t>]</m:t>
-        </m:r>
+        </m:d>
         <m:r>
           <m:rPr>
             <m:sty m:val="p"/>
@@ -3172,10 +3176,10 @@
       </w:r>
       <m:oMath>
         <m:r>
-          <m:t>P</m:t>
-        </m:r>
-        <m:r>
-          <m:t>r</m:t>
+          <m:rPr>
+            <m:sty m:val="p"/>
+          </m:rPr>
+          <m:t>Pr</m:t>
         </m:r>
         <m:r>
           <m:rPr>
@@ -3267,10 +3271,10 @@
       </w:r>
       <m:oMath>
         <m:r>
-          <m:t>P</m:t>
-        </m:r>
-        <m:r>
-          <m:t>r</m:t>
+          <m:rPr>
+            <m:sty m:val="p"/>
+          </m:rPr>
+          <m:t>Pr</m:t>
         </m:r>
         <m:r>
           <m:rPr>
@@ -3406,10 +3410,10 @@
         </m:oMathParaPr>
         <m:oMath>
           <m:r>
-            <m:t>P</m:t>
-          </m:r>
-          <m:r>
-            <m:t>r</m:t>
+            <m:rPr>
+              <m:sty m:val="p"/>
+            </m:rPr>
+            <m:t>Pr</m:t>
           </m:r>
           <m:r>
             <m:rPr>
@@ -3460,10 +3464,10 @@
             <m:t>=</m:t>
           </m:r>
           <m:r>
-            <m:t>P</m:t>
-          </m:r>
-          <m:r>
-            <m:t>r</m:t>
+            <m:rPr>
+              <m:sty m:val="p"/>
+            </m:rPr>
+            <m:t>Pr</m:t>
           </m:r>
           <m:r>
             <m:rPr>
@@ -3736,10 +3740,10 @@
       </w:r>
       <m:oMath>
         <m:r>
-          <m:t>P</m:t>
-        </m:r>
-        <m:r>
-          <m:t>r</m:t>
+          <m:rPr>
+            <m:sty m:val="p"/>
+          </m:rPr>
+          <m:t>Pr</m:t>
         </m:r>
         <m:r>
           <m:rPr>
@@ -3790,10 +3794,10 @@
           <m:t>−</m:t>
         </m:r>
         <m:r>
-          <m:t>P</m:t>
-        </m:r>
-        <m:r>
-          <m:t>r</m:t>
+          <m:rPr>
+            <m:sty m:val="p"/>
+          </m:rPr>
+          <m:t>Pr</m:t>
         </m:r>
         <m:r>
           <m:rPr>
@@ -3862,10 +3866,10 @@
       </w:r>
       <m:oMath>
         <m:r>
-          <m:t>P</m:t>
-        </m:r>
-        <m:r>
-          <m:t>r</m:t>
+          <m:rPr>
+            <m:sty m:val="p"/>
+          </m:rPr>
+          <m:t>Pr</m:t>
         </m:r>
         <m:r>
           <m:rPr>
@@ -3916,10 +3920,10 @@
           <m:t>/</m:t>
         </m:r>
         <m:r>
-          <m:t>P</m:t>
-        </m:r>
-        <m:r>
-          <m:t>r</m:t>
+          <m:rPr>
+            <m:sty m:val="p"/>
+          </m:rPr>
+          <m:t>Pr</m:t>
         </m:r>
         <m:r>
           <m:rPr>
@@ -3996,10 +4000,10 @@
           </m:fPr>
           <m:num>
             <m:r>
-              <m:t>P</m:t>
-            </m:r>
-            <m:r>
-              <m:t>r</m:t>
+              <m:rPr>
+                <m:sty m:val="p"/>
+              </m:rPr>
+              <m:t>Pr</m:t>
             </m:r>
             <m:r>
               <m:rPr>
@@ -4050,10 +4054,10 @@
               <m:t>/</m:t>
             </m:r>
             <m:r>
-              <m:t>P</m:t>
-            </m:r>
-            <m:r>
-              <m:t>r</m:t>
+              <m:rPr>
+                <m:sty m:val="p"/>
+              </m:rPr>
+              <m:t>Pr</m:t>
             </m:r>
             <m:r>
               <m:rPr>
@@ -4100,10 +4104,10 @@
           </m:num>
           <m:den>
             <m:r>
-              <m:t>P</m:t>
-            </m:r>
-            <m:r>
-              <m:t>r</m:t>
+              <m:rPr>
+                <m:sty m:val="p"/>
+              </m:rPr>
+              <m:t>Pr</m:t>
             </m:r>
             <m:r>
               <m:rPr>
@@ -4154,10 +4158,10 @@
               <m:t>/</m:t>
             </m:r>
             <m:r>
-              <m:t>P</m:t>
-            </m:r>
-            <m:r>
-              <m:t>r</m:t>
+              <m:rPr>
+                <m:sty m:val="p"/>
+              </m:rPr>
+              <m:t>Pr</m:t>
             </m:r>
             <m:r>
               <m:rPr>
@@ -4246,10 +4250,10 @@
       </w:r>
       <m:oMath>
         <m:r>
-          <m:t>P</m:t>
-        </m:r>
-        <m:r>
-          <m:t>r</m:t>
+          <m:rPr>
+            <m:sty m:val="p"/>
+          </m:rPr>
+          <m:t>Pr</m:t>
         </m:r>
         <m:r>
           <m:rPr>
@@ -4300,10 +4304,10 @@
           <m:t>=</m:t>
         </m:r>
         <m:r>
-          <m:t>P</m:t>
-        </m:r>
-        <m:r>
-          <m:t>r</m:t>
+          <m:rPr>
+            <m:sty m:val="p"/>
+          </m:rPr>
+          <m:t>Pr</m:t>
         </m:r>
         <m:r>
           <m:rPr>
@@ -4381,10 +4385,10 @@
       </w:r>
       <m:oMath>
         <m:r>
-          <m:t>P</m:t>
-        </m:r>
-        <m:r>
-          <m:t>r</m:t>
+          <m:rPr>
+            <m:sty m:val="p"/>
+          </m:rPr>
+          <m:t>Pr</m:t>
         </m:r>
         <m:r>
           <m:rPr>
@@ -4453,10 +4457,10 @@
           <m:t>=</m:t>
         </m:r>
         <m:r>
-          <m:t>P</m:t>
-        </m:r>
-        <m:r>
-          <m:t>r</m:t>
+          <m:rPr>
+            <m:sty m:val="p"/>
+          </m:rPr>
+          <m:t>Pr</m:t>
         </m:r>
         <m:r>
           <m:rPr>
@@ -4603,10 +4607,10 @@
       </w:r>
       <m:oMath>
         <m:r>
-          <m:t>P</m:t>
-        </m:r>
-        <m:r>
-          <m:t>r</m:t>
+          <m:rPr>
+            <m:sty m:val="p"/>
+          </m:rPr>
+          <m:t>Pr</m:t>
         </m:r>
         <m:r>
           <m:rPr>
@@ -4659,10 +4663,10 @@
       </w:r>
       <m:oMath>
         <m:r>
-          <m:t>P</m:t>
-        </m:r>
-        <m:r>
-          <m:t>r</m:t>
+          <m:rPr>
+            <m:sty m:val="p"/>
+          </m:rPr>
+          <m:t>Pr</m:t>
         </m:r>
         <m:r>
           <m:rPr>
@@ -4780,10 +4784,10 @@
       </w:r>
       <m:oMath>
         <m:r>
-          <m:t>P</m:t>
-        </m:r>
-        <m:r>
-          <m:t>r</m:t>
+          <m:rPr>
+            <m:sty m:val="p"/>
+          </m:rPr>
+          <m:t>Pr</m:t>
         </m:r>
         <m:r>
           <m:rPr>
@@ -4836,10 +4840,10 @@
       </w:r>
       <m:oMath>
         <m:r>
-          <m:t>P</m:t>
-        </m:r>
-        <m:r>
-          <m:t>r</m:t>
+          <m:rPr>
+            <m:sty m:val="p"/>
+          </m:rPr>
+          <m:t>Pr</m:t>
         </m:r>
         <m:r>
           <m:rPr>

</xml_diff>